<commit_message>
feat: manage website posts in bulk
</commit_message>
<xml_diff>
--- a/docs/Huong_dan_su_dung_PMEDIA_Dang_Bai_Tu_Dong_WordPress.docx
+++ b/docs/Huong_dan_su_dung_PMEDIA_Dang_Bai_Tu_Dong_WordPress.docx
@@ -14,7 +14,7 @@
           <w:color w:val="2E74B5"/>
           <w:sz w:val="48"/>
         </w:rPr>
-        <w:t>Hướng dẫn sử dụng PMEDIA - Đăng bài tự động WordPress</w:t>
+        <w:t>Hướng dẫn sử dụng PMEDIA - ĐĂNG BÀI TỰ ĐỘNG WORDPRESS</w:t>
       </w:r>
     </w:p>
     <w:p>
@@ -90,7 +90,7 @@
         <w:rPr>
           <w:rFonts w:ascii="Calibri" w:hAnsi="Calibri" w:eastAsia="Calibri"/>
         </w:rPr>
-        <w:t>PMEDIA - Đăng bài tự động WordPress là app desktop dùng để đọc file Excel, kiểm tra preview, upload ảnh local vào Media Library và tạo hoặc cập nhật bài viết WordPress qua REST API.</w:t>
+        <w:t>PMEDIA - ĐĂNG BÀI TỰ ĐỘNG WORDPRESS là app desktop dùng để đọc file Excel, kiểm tra preview, upload ảnh local vào Media Library và tạo hoặc cập nhật bài viết WordPress qua REST API.</w:t>
       </w:r>
     </w:p>
     <w:p>
@@ -287,9 +287,9 @@
             <w:r>
               <w:rPr>
                 <w:rFonts w:ascii="Calibri" w:hAnsi="Calibri" w:eastAsia="Calibri"/>
-                <w:sz w:val="22"/>
+                <w:sz w:val="20"/>
               </w:rPr>
-              <w:t>C:\Users\Admin\OneDrive\Tài liệu\Đăng bài tự động\dist\PMEDIA-DangBaiTuDongWordPress.exe</w:t>
+              <w:t>C:\Users\Admin\OneDrive\Tài liệu\Đăng bài tự động\dist\PMEDIA-DANG-BAI-TU-DONG-WORDPRESS.exe</w:t>
             </w:r>
           </w:p>
         </w:tc>
@@ -1113,6 +1113,157 @@
                 <w:rFonts w:ascii="Calibri" w:hAnsi="Calibri" w:eastAsia="Calibri"/>
               </w:rPr>
               <w:t>Lỗi này nghĩa là WordPress chưa chấp nhận thông tin đăng nhập API. Hãy tạo lại Application Password đúng user, kiểm tra username, kiểm tra URL có https:// và kiểm tra plugin bảo mật/hosting có chặn REST API hay không.</w:t>
+            </w:r>
+          </w:p>
+        </w:tc>
+      </w:tr>
+    </w:tbl>
+    <w:p/>
+    <w:p>
+      <w:pPr>
+        <w:pStyle w:val="Heading2"/>
+      </w:pPr>
+      <w:r>
+        <w:t>3.2. Cài plugin metadata SEO cho Rank Math</w:t>
+      </w:r>
+    </w:p>
+    <w:p>
+      <w:r>
+        <w:rPr>
+          <w:rFonts w:ascii="Calibri" w:hAnsi="Calibri" w:eastAsia="Calibri"/>
+        </w:rPr>
+        <w:t>Plugin này giúp WordPress REST API cho phép app ghi Tiêu đề SEO, Thẻ mô tả, Từ khóa chính và permalink vào Rank Math. Nên cài plugin trước khi chạy đăng bài chính thức, đặc biệt nếu sau khi test các ô Rank Math vẫn hiện trống trong phần Xem trước trình chỉnh sửa đoạn trích.</w:t>
+      </w:r>
+    </w:p>
+    <w:p>
+      <w:pPr>
+        <w:pStyle w:val="ListNumber"/>
+      </w:pPr>
+      <w:r>
+        <w:rPr>
+          <w:rFonts w:ascii="Calibri" w:hAnsi="Calibri" w:eastAsia="Calibri"/>
+        </w:rPr>
+        <w:t>Mở WordPress Admin của website cần đăng bài.</w:t>
+      </w:r>
+    </w:p>
+    <w:p>
+      <w:pPr>
+        <w:pStyle w:val="ListNumber"/>
+      </w:pPr>
+      <w:r>
+        <w:rPr>
+          <w:rFonts w:ascii="Calibri" w:hAnsi="Calibri" w:eastAsia="Calibri"/>
+        </w:rPr>
+        <w:t>Vào Plugins -&gt; Add New hoặc Gói mở rộng -&gt; Cài mới.</w:t>
+      </w:r>
+    </w:p>
+    <w:p>
+      <w:pPr>
+        <w:pStyle w:val="ListNumber"/>
+      </w:pPr>
+      <w:r>
+        <w:rPr>
+          <w:rFonts w:ascii="Calibri" w:hAnsi="Calibri" w:eastAsia="Calibri"/>
+        </w:rPr>
+        <w:t>Bấm Upload Plugin hoặc Tải plugin lên.</w:t>
+      </w:r>
+    </w:p>
+    <w:p>
+      <w:pPr>
+        <w:pStyle w:val="ListNumber"/>
+      </w:pPr>
+      <w:r>
+        <w:rPr>
+          <w:rFonts w:ascii="Calibri" w:hAnsi="Calibri" w:eastAsia="Calibri"/>
+        </w:rPr>
+        <w:t>Chọn file wordpress/wordpress-auto-poster-rank-math-rest-meta.zip trong gói bàn giao.</w:t>
+      </w:r>
+    </w:p>
+    <w:p>
+      <w:pPr>
+        <w:pStyle w:val="ListNumber"/>
+      </w:pPr>
+      <w:r>
+        <w:rPr>
+          <w:rFonts w:ascii="Calibri" w:hAnsi="Calibri" w:eastAsia="Calibri"/>
+        </w:rPr>
+        <w:t>Bấm Install Now hoặc Cài đặt ngay.</w:t>
+      </w:r>
+    </w:p>
+    <w:p>
+      <w:pPr>
+        <w:pStyle w:val="ListNumber"/>
+      </w:pPr>
+      <w:r>
+        <w:rPr>
+          <w:rFonts w:ascii="Calibri" w:hAnsi="Calibri" w:eastAsia="Calibri"/>
+        </w:rPr>
+        <w:t>Sau khi cài xong, bấm Activate hoặc Kích hoạt.</w:t>
+      </w:r>
+    </w:p>
+    <w:p>
+      <w:pPr>
+        <w:pStyle w:val="ListNumber"/>
+      </w:pPr>
+      <w:r>
+        <w:rPr>
+          <w:rFonts w:ascii="Calibri" w:hAnsi="Calibri" w:eastAsia="Calibri"/>
+        </w:rPr>
+        <w:t>Quay lại app PMEDIA, bấm Kiểm tra kết nối rồi đăng thử 1 bài ở trạng thái draft.</w:t>
+      </w:r>
+    </w:p>
+    <w:p>
+      <w:pPr>
+        <w:pStyle w:val="ListNumber"/>
+      </w:pPr>
+      <w:r>
+        <w:rPr>
+          <w:rFonts w:ascii="Calibri" w:hAnsi="Calibri" w:eastAsia="Calibri"/>
+        </w:rPr>
+        <w:t>Mở bài draft trong WordPress và kiểm tra Rank Math đã có Tiêu đề SEO, Thẻ mô tả và Từ khóa chính.</w:t>
+      </w:r>
+    </w:p>
+    <w:tbl>
+      <w:tblPr>
+        <w:tblStyle w:val="TableGrid"/>
+        <w:tblW w:type="dxa" w:w="9360"/>
+        <w:jc w:val="center"/>
+        <w:tblLayout w:type="fixed"/>
+        <w:tblLook w:firstColumn="1" w:firstRow="1" w:lastColumn="0" w:lastRow="0" w:noHBand="0" w:noVBand="1" w:val="04A0"/>
+      </w:tblPr>
+      <w:tblGrid>
+        <w:gridCol w:w="9360"/>
+      </w:tblGrid>
+      <w:tr>
+        <w:tc>
+          <w:tcPr>
+            <w:tcW w:type="dxa" w:w="9360"/>
+            <w:vAlign w:val="center"/>
+            <w:tcMar>
+              <w:top w:w="80" w:type="dxa"/>
+              <w:start w:w="120" w:type="dxa"/>
+              <w:bottom w:w="80" w:type="dxa"/>
+              <w:end w:w="120" w:type="dxa"/>
+            </w:tcMar>
+            <w:shd w:fill="E8EEF5"/>
+          </w:tcPr>
+          <w:p>
+            <w:pPr>
+              <w:spacing w:after="0"/>
+            </w:pPr>
+            <w:r>
+              <w:rPr>
+                <w:rFonts w:ascii="Calibri" w:hAnsi="Calibri" w:eastAsia="Calibri"/>
+                <w:b/>
+                <w:color w:val="1F4D78"/>
+              </w:rPr>
+              <w:t xml:space="preserve">Khi nào bắt buộc cài plugin metadata?: </w:t>
+            </w:r>
+            <w:r>
+              <w:rPr>
+                <w:rFonts w:ascii="Calibri" w:hAnsi="Calibri" w:eastAsia="Calibri"/>
+              </w:rPr>
+              <w:t>Nếu WordPress vẫn tạo được bài nhưng Rank Math không nhận SEO title, mô tả meta hoặc focus keyword, hãy cài plugin này rồi chạy lại. Với bài đã tồn tại, app sẽ cập nhật lại metadata SEO khi xử lý bài trùng.</w:t>
             </w:r>
           </w:p>
         </w:tc>
@@ -2997,7 +3148,7 @@
         <w:rPr>
           <w:rFonts w:ascii="Calibri" w:hAnsi="Calibri" w:eastAsia="Calibri"/>
         </w:rPr>
-        <w:t>Mở file PMEDIA-DangBaiTuDongWordPress.exe.</w:t>
+        <w:t>Mở file PMEDIA-DANG-BAI-TU-DONG-WORDPRESS.exe.</w:t>
       </w:r>
     </w:p>
     <w:p>
@@ -5379,7 +5530,7 @@
         <w:color w:val="5A5A5A"/>
         <w:sz w:val="18"/>
       </w:rPr>
-      <w:t>PMEDIA - Đăng bài tự động WordPress</w:t>
+      <w:t>PMEDIA - ĐĂNG BÀI TỰ ĐỘNG WORDPRESS</w:t>
     </w:r>
   </w:p>
 </w:hdr>

</xml_diff>